<commit_message>
Update target-spec.docx to match current V2 implementation
Key changes:
- Remove oa_version = 2; header requirement; document per-vector auto-detection
- Fix case_additions column count: 8-9 (variable, cut/build is optional)
- Fix [es] and [sp] columns: always present as [] when unused (not omitted)
- Fix shape name lists: oa1-4, aridge1-4, add o/r1-4/rr2/rr4
- Document negative shapes (-r1, -tab2, etc.) in case_additions
- Document unsupported V2 case_additions shapes (r, -r, c, -c)
- Update example rows to match current format

Co-Authored-By: Claude Sonnet 4.6 <noreply@anthropic.com>
</commit_message>
<xml_diff>
--- a/OA migration script/target-spec.docx
+++ b/OA migration script/target-spec.docx
@@ -33,20 +33,7 @@
     </w:p>
     <w:p>
       <w:r>
-        <w:t>The file begins with:</w:t>
-      </w:r>
-    </w:p>
-    <w:p>
-      <w:pPr>
-        <w:shd w:val="clear" w:color="auto" w:fill="F2F2F2"/>
-        <w:ind w:left="360"/>
-      </w:pPr>
-      <w:r>
-        <w:rPr>
-          <w:rFonts w:ascii="Courier New" w:hAnsi="Courier New"/>
-          <w:sz w:val="18"/>
-        </w:rPr>
-        <w:t>oa_version = 2;</w:t>
+        <w:t>No version header is required. Format is auto-detected per vector: a row is V2 when column index 1 holds a quoted string (the shape name). A row is V1 when column index 1 is a number (the x coordinate). Each of the four vectors (screen_openings, case_openings, tablet_openings, case_additions) is detected independently, so a file can mix V1 and V2 vectors.</w:t>
       </w:r>
     </w:p>
     <w:p>
@@ -222,7 +209,7 @@
           </w:tcPr>
           <w:p>
             <w:r>
-              <w:t>9</w:t>
+              <w:t>8–9</w:t>
             </w:r>
           </w:p>
         </w:tc>
@@ -883,7 +870,7 @@
           </w:tcPr>
           <w:p>
             <w:r>
-              <w:t>Optional; omitted if empty</w:t>
+              <w:t>Always present; [] if unused</w:t>
             </w:r>
           </w:p>
         </w:tc>
@@ -925,7 +912,7 @@
           </w:tcPr>
           <w:p>
             <w:r>
-              <w:t>Optional; omitted if empty</w:t>
+              <w:t>Always present; [] if unused</w:t>
             </w:r>
           </w:p>
         </w:tc>
@@ -1247,7 +1234,7 @@
           </w:tcPr>
           <w:p>
             <w:r>
-              <w:t>r, rr, c, hd, oa*, cr, crr</w:t>
+              <w:t>r, rr, o, c, hd, oa1–4, r1–4, rr2, rr4, cr, crr</w:t>
             </w:r>
           </w:p>
         </w:tc>
@@ -1309,7 +1296,7 @@
           </w:tcPr>
           <w:p>
             <w:r>
-              <w:t>ridge, cridge, rridge, crridge, aridge*</w:t>
+              <w:t>ridge, cridge, rridge, crridge, aridge1–4</w:t>
             </w:r>
           </w:p>
         </w:tc>
@@ -1618,7 +1605,7 @@
         <w:pStyle w:val="Heading1"/>
       </w:pPr>
       <w:r>
-        <w:t>V2 Row Format — case_additions (9 columns)</w:t>
+        <w:t>V2 Row Format — case_additions (8–9 columns (variable))</w:t>
       </w:r>
     </w:p>
     <w:p>
@@ -1631,15 +1618,26 @@
           <w:rFonts w:ascii="Courier New" w:hAnsi="Courier New"/>
           <w:sz w:val="18"/>
         </w:rPr>
-        <w:t>[ID, shape, height, width, corner, x, y, cut/build, [trim]]</w:t>
+        <w:t>Without cut/build:  [ID, shape, height, width, corner, x, y,      [trim]]</w:t>
+        <w:br/>
+        <w:t xml:space="preserve">                     [0]  [1]    [2]    [3]    [4]   [5] [6]        [7]</w:t>
+        <w:br/>
+        <w:br/>
+        <w:t>With    cut/build:  [ID, shape, height, width, corner, x, y, cb,   [trim]]</w:t>
+        <w:br/>
+        <w:t xml:space="preserve">                     [0]  [1]    [2]    [3]    [4]   [5] [6] [7]    [8]</w:t>
+        <w:br/>
+        <w:br/>
+        <w:t>cut/build (cb) is present when element [7] is a number. [trim] is always the last element and always a sub-array ([] if not needed).</w:t>
+        <w:br/>
+        <w:br/>
+        <w:t>Negative shapes (prefix "-", e.g. -r1, -tab2) create edge subtractions. The shapes "r", "-r", "c", and "-c" are not supported in V2 case_additions; use r1-4 instead.</w:t>
       </w:r>
       <w:r>
         <w:rPr>
           <w:rFonts w:ascii="Courier New" w:hAnsi="Courier New"/>
           <w:sz w:val="18"/>
         </w:rPr>
-        <w:br/>
-        <w:t xml:space="preserve"> [0]  [1]    [2]    [3]    [4]    [5] [6]    [7]      [8]</w:t>
       </w:r>
     </w:p>
     <w:tbl>
@@ -1946,7 +1944,7 @@
           </w:tcPr>
           <w:p>
             <w:r>
-              <w:t>Always 0 (= default) or explicit value</w:t>
+              <w:t>Optional number. Omit when full-height (default). Detected by checking whether element [7] is a number.</w:t>
             </w:r>
           </w:p>
         </w:tc>
@@ -1978,7 +1976,7 @@
           </w:tcPr>
           <w:p>
             <w:r>
-              <w:t>Optional sub-array</w:t>
+              <w:t>Always the last element; [] if not needed</w:t>
             </w:r>
           </w:p>
         </w:tc>
@@ -2002,61 +2000,76 @@
           <w:rFonts w:ascii="Courier New" w:hAnsi="Courier New"/>
           <w:sz w:val="18"/>
         </w:rPr>
-        <w:t>// screen_openings — standard rectangular opening, full depth, left-anchor, top surface</w:t>
+        <w:t>// screen_openings -- standard rectangular opening, full depth, left-anchor, top surface</w:t>
+        <w:br/>
+        <w:t>[1, "r", 45.0, 45.0, 2.0, 10.5, -22.3, 0, "L", "T", 0, 0, [], []],</w:t>
+        <w:br/>
+        <w:br/>
+        <w:t>// screen_openings -- ridge, ridge_height=1.5, length=45, base thickness=2, rightward</w:t>
+        <w:br/>
+        <w:t>[2, "ridge", 3.0, 0, 0, 0, 0, 1.5, "L", "T", 45.0, 2.0, [], ["right"]],</w:t>
+        <w:br/>
+        <w:br/>
+        <w:t>// case_openings -- centre-anchored circle, full depth, bottom surface</w:t>
+        <w:br/>
+        <w:t>[3, "c", 12.0, 12.0, 0, 0, 0, 0, "C", "B", 0, 0, [], []],</w:t>
+        <w:br/>
+        <w:br/>
+        <w:t>// case_additions -- r1 shape raised 5 mm thick, no trim</w:t>
+        <w:br/>
+        <w:t>[4, "r1", 20.0, 15.0, 2.0, 5.0, 5.0, 5.0, []],</w:t>
+        <w:br/>
+        <w:br/>
+        <w:t>// case_additions -- full-height tab1 (no cut/build column)</w:t>
+        <w:br/>
+        <w:t>[5, "tab1", 8.0, 6.0, 1.5, 0, 0, []],</w:t>
+        <w:br/>
+        <w:br/>
+        <w:t>// case_additions -- negative shape (edge subtraction), trimmed above at 10 mm</w:t>
+        <w:br/>
+        <w:t>[6, "-r1", 10.0, 8.0, 0, 0, 0, [10, -999, -999, -999]],</w:t>
       </w:r>
       <w:r>
         <w:rPr>
           <w:rFonts w:ascii="Courier New" w:hAnsi="Courier New"/>
           <w:sz w:val="18"/>
         </w:rPr>
-        <w:br/>
-        <w:t>[1, "r", 45.0, 45.0, 2.0, 10.5, -22.3, 0, "L", "T", 0, 0],</w:t>
       </w:r>
       <w:r>
         <w:rPr>
           <w:rFonts w:ascii="Courier New" w:hAnsi="Courier New"/>
           <w:sz w:val="18"/>
         </w:rPr>
-        <w:br/>
       </w:r>
       <w:r>
         <w:rPr>
           <w:rFonts w:ascii="Courier New" w:hAnsi="Courier New"/>
           <w:sz w:val="18"/>
         </w:rPr>
-        <w:br/>
-        <w:t>// screen_openings — ridge, height 3.0, with ridge_height=1.5, length=45, thickness=2</w:t>
       </w:r>
       <w:r>
         <w:rPr>
           <w:rFonts w:ascii="Courier New" w:hAnsi="Courier New"/>
           <w:sz w:val="18"/>
         </w:rPr>
-        <w:br/>
-        <w:t>[2, "ridge", 3.0, 0, 0, 0, 0, 1.5, "L", "T", 45.0, 2.0],</w:t>
       </w:r>
       <w:r>
         <w:rPr>
           <w:rFonts w:ascii="Courier New" w:hAnsi="Courier New"/>
           <w:sz w:val="18"/>
         </w:rPr>
-        <w:br/>
       </w:r>
       <w:r>
         <w:rPr>
           <w:rFonts w:ascii="Courier New" w:hAnsi="Courier New"/>
           <w:sz w:val="18"/>
         </w:rPr>
-        <w:br/>
-        <w:t>// case_openings — centre-anchored circle, built on bottom surface</w:t>
       </w:r>
       <w:r>
         <w:rPr>
           <w:rFonts w:ascii="Courier New" w:hAnsi="Courier New"/>
           <w:sz w:val="18"/>
         </w:rPr>
-        <w:br/>
-        <w:t>[3, "c", 12.0, 12.0, 0, 0, 0, 0, "C", "B", 0, 0],</w:t>
       </w:r>
     </w:p>
     <w:sectPr>

</xml_diff>

<commit_message>
Fix invalid V2 shape names in target-spec.docx
Remove rr, o, rr2, rr4, cr, crr from standard shapes (rr/cr/crr are
internal runtime names, not V2 author-facing shape strings). Remove
crridge from ridge shapes. Corrected lists: r, c, hd, oa1-4, r1-4
and ridge, cridge, rridge, aridge1-4.

Co-Authored-By: Claude Sonnet 4.6 <noreply@anthropic.com>
</commit_message>
<xml_diff>
--- a/OA migration script/target-spec.docx
+++ b/OA migration script/target-spec.docx
@@ -629,6 +629,7 @@
           </w:tcPr>
           <w:p>
             <w:r>
+              <w:lastRenderedPageBreak/>
               <w:t>7</w:t>
             </w:r>
           </w:p>
@@ -713,7 +714,6 @@
           </w:tcPr>
           <w:p>
             <w:r>
-              <w:lastRenderedPageBreak/>
               <w:t>9</w:t>
             </w:r>
           </w:p>
@@ -1140,12 +1140,12 @@
         <w:tblLook w:val="04A0" w:firstRow="1" w:lastRow="0" w:firstColumn="1" w:lastColumn="0" w:noHBand="0" w:noVBand="1"/>
       </w:tblPr>
       <w:tblGrid>
-        <w:gridCol w:w="2204"/>
-        <w:gridCol w:w="1187"/>
-        <w:gridCol w:w="1187"/>
-        <w:gridCol w:w="1525"/>
-        <w:gridCol w:w="1288"/>
-        <w:gridCol w:w="1465"/>
+        <w:gridCol w:w="2220"/>
+        <w:gridCol w:w="1184"/>
+        <w:gridCol w:w="1184"/>
+        <w:gridCol w:w="1523"/>
+        <w:gridCol w:w="1284"/>
+        <w:gridCol w:w="1461"/>
       </w:tblGrid>
       <w:tr>
         <w:tc>
@@ -1234,7 +1234,7 @@
           </w:tcPr>
           <w:p>
             <w:r>
-              <w:t>r, rr, o, c, hd, oa1–4, r1–4, rr2, rr4, cr, crr</w:t>
+              <w:t>r, c, hd, oa1–4, r1–4</w:t>
             </w:r>
           </w:p>
         </w:tc>
@@ -1296,7 +1296,7 @@
           </w:tcPr>
           <w:p>
             <w:r>
-              <w:t>ridge, cridge, rridge, crridge, aridge1–4</w:t>
+              <w:t>ridge, cridge, rridge, aridge1–4</w:t>
             </w:r>
           </w:p>
         </w:tc>
@@ -1619,25 +1619,68 @@
           <w:sz w:val="18"/>
         </w:rPr>
         <w:t>Without cut/build:  [ID, shape, height, width, corner, x, y,      [trim]]</w:t>
-        <w:br/>
-        <w:t xml:space="preserve">                     [0]  [1]    [2]    [3]    [4]   [5] [6]        [7]</w:t>
-        <w:br/>
-        <w:br/>
-        <w:t>With    cut/build:  [ID, shape, height, width, corner, x, y, cb,   [trim]]</w:t>
-        <w:br/>
-        <w:t xml:space="preserve">                     [0]  [1]    [2]    [3]    [4]   [5] [6] [7]    [8]</w:t>
-        <w:br/>
-        <w:br/>
-        <w:t>cut/build (cb) is present when element [7] is a number. [trim] is always the last element and always a sub-array ([] if not needed).</w:t>
-        <w:br/>
-        <w:br/>
-        <w:t>Negative shapes (prefix "-", e.g. -r1, -tab2) create edge subtractions. The shapes "r", "-r", "c", and "-c" are not supported in V2 case_additions; use r1-4 instead.</w:t>
       </w:r>
       <w:r>
         <w:rPr>
           <w:rFonts w:ascii="Courier New" w:hAnsi="Courier New"/>
           <w:sz w:val="18"/>
         </w:rPr>
+        <w:br/>
+        <w:t xml:space="preserve">                     [0]  [1]    [2]    [3]    [4]   [5] [6]        [7]</w:t>
+      </w:r>
+      <w:r>
+        <w:rPr>
+          <w:rFonts w:ascii="Courier New" w:hAnsi="Courier New"/>
+          <w:sz w:val="18"/>
+        </w:rPr>
+        <w:br/>
+      </w:r>
+      <w:r>
+        <w:rPr>
+          <w:rFonts w:ascii="Courier New" w:hAnsi="Courier New"/>
+          <w:sz w:val="18"/>
+        </w:rPr>
+        <w:br/>
+        <w:t>With    cut/build:  [ID, shape, height, width, corner, x, y, cb,   [trim]]</w:t>
+      </w:r>
+      <w:r>
+        <w:rPr>
+          <w:rFonts w:ascii="Courier New" w:hAnsi="Courier New"/>
+          <w:sz w:val="18"/>
+        </w:rPr>
+        <w:br/>
+        <w:t xml:space="preserve">                     [0]  [1]    [2]    [3]    [4]   [5] [6] [7]    [8]</w:t>
+      </w:r>
+      <w:r>
+        <w:rPr>
+          <w:rFonts w:ascii="Courier New" w:hAnsi="Courier New"/>
+          <w:sz w:val="18"/>
+        </w:rPr>
+        <w:br/>
+      </w:r>
+      <w:r>
+        <w:rPr>
+          <w:rFonts w:ascii="Courier New" w:hAnsi="Courier New"/>
+          <w:sz w:val="18"/>
+        </w:rPr>
+        <w:lastRenderedPageBreak/>
+        <w:br/>
+        <w:t>cut/build (cb) is present when element [7] is a number. [trim] is always the last element and always a sub-array ([] if not needed).</w:t>
+      </w:r>
+      <w:r>
+        <w:rPr>
+          <w:rFonts w:ascii="Courier New" w:hAnsi="Courier New"/>
+          <w:sz w:val="18"/>
+        </w:rPr>
+        <w:br/>
+      </w:r>
+      <w:r>
+        <w:rPr>
+          <w:rFonts w:ascii="Courier New" w:hAnsi="Courier New"/>
+          <w:sz w:val="18"/>
+        </w:rPr>
+        <w:br/>
+        <w:t>Negative shapes (prefix "-", e.g. -r1, -tab2) create edge subtractions. The shapes "r", "-r", "c", and "-c" are not supported in V2 case_additions; use r1-4 instead.</w:t>
       </w:r>
     </w:p>
     <w:tbl>
@@ -1827,7 +1870,6 @@
           </w:tcPr>
           <w:p>
             <w:r>
-              <w:lastRenderedPageBreak/>
               <w:t>4</w:t>
             </w:r>
           </w:p>
@@ -2001,75 +2043,129 @@
           <w:sz w:val="18"/>
         </w:rPr>
         <w:t>// screen_openings -- standard rectangular opening, full depth, left-anchor, top surface</w:t>
-        <w:br/>
-        <w:t>[1, "r", 45.0, 45.0, 2.0, 10.5, -22.3, 0, "L", "T", 0, 0, [], []],</w:t>
-        <w:br/>
-        <w:br/>
-        <w:t>// screen_openings -- ridge, ridge_height=1.5, length=45, base thickness=2, rightward</w:t>
-        <w:br/>
-        <w:t>[2, "ridge", 3.0, 0, 0, 0, 0, 1.5, "L", "T", 45.0, 2.0, [], ["right"]],</w:t>
-        <w:br/>
-        <w:br/>
-        <w:t>// case_openings -- centre-anchored circle, full depth, bottom surface</w:t>
-        <w:br/>
-        <w:t>[3, "c", 12.0, 12.0, 0, 0, 0, 0, "C", "B", 0, 0, [], []],</w:t>
-        <w:br/>
-        <w:br/>
-        <w:t>// case_additions -- r1 shape raised 5 mm thick, no trim</w:t>
-        <w:br/>
-        <w:t>[4, "r1", 20.0, 15.0, 2.0, 5.0, 5.0, 5.0, []],</w:t>
-        <w:br/>
-        <w:br/>
-        <w:t>// case_additions -- full-height tab1 (no cut/build column)</w:t>
-        <w:br/>
-        <w:t>[5, "tab1", 8.0, 6.0, 1.5, 0, 0, []],</w:t>
-        <w:br/>
-        <w:br/>
-        <w:t>// case_additions -- negative shape (edge subtraction), trimmed above at 10 mm</w:t>
-        <w:br/>
-        <w:t>[6, "-r1", 10.0, 8.0, 0, 0, 0, [10, -999, -999, -999]],</w:t>
       </w:r>
       <w:r>
         <w:rPr>
           <w:rFonts w:ascii="Courier New" w:hAnsi="Courier New"/>
           <w:sz w:val="18"/>
         </w:rPr>
+        <w:br/>
+        <w:t>[1, "r", 45.0, 45.0, 2.0, 10.5, -22.3, 0, "L", "T", 0, 0, [], []],</w:t>
       </w:r>
       <w:r>
         <w:rPr>
           <w:rFonts w:ascii="Courier New" w:hAnsi="Courier New"/>
           <w:sz w:val="18"/>
         </w:rPr>
+        <w:br/>
       </w:r>
       <w:r>
         <w:rPr>
           <w:rFonts w:ascii="Courier New" w:hAnsi="Courier New"/>
           <w:sz w:val="18"/>
         </w:rPr>
+        <w:br/>
+        <w:t>// screen_openings -- ridge, ridge_height=1.5, length=45, base thickness=2, rightward</w:t>
       </w:r>
       <w:r>
         <w:rPr>
           <w:rFonts w:ascii="Courier New" w:hAnsi="Courier New"/>
           <w:sz w:val="18"/>
         </w:rPr>
+        <w:br/>
+        <w:t>[2, "ridge", 3.0, 0, 0, 0, 0, 1.5, "L", "T", 45.0, 2.0, [], ["right"]],</w:t>
       </w:r>
       <w:r>
         <w:rPr>
           <w:rFonts w:ascii="Courier New" w:hAnsi="Courier New"/>
           <w:sz w:val="18"/>
         </w:rPr>
+        <w:br/>
       </w:r>
       <w:r>
         <w:rPr>
           <w:rFonts w:ascii="Courier New" w:hAnsi="Courier New"/>
           <w:sz w:val="18"/>
         </w:rPr>
+        <w:br/>
+        <w:t>// case_openings -- centre-anchored circle, full depth, bottom surface</w:t>
       </w:r>
       <w:r>
         <w:rPr>
           <w:rFonts w:ascii="Courier New" w:hAnsi="Courier New"/>
           <w:sz w:val="18"/>
         </w:rPr>
+        <w:br/>
+        <w:t>[3, "c", 12.0, 12.0, 0, 0, 0, 0, "C", "B", 0, 0, [], []],</w:t>
+      </w:r>
+      <w:r>
+        <w:rPr>
+          <w:rFonts w:ascii="Courier New" w:hAnsi="Courier New"/>
+          <w:sz w:val="18"/>
+        </w:rPr>
+        <w:br/>
+      </w:r>
+      <w:r>
+        <w:rPr>
+          <w:rFonts w:ascii="Courier New" w:hAnsi="Courier New"/>
+          <w:sz w:val="18"/>
+        </w:rPr>
+        <w:br/>
+        <w:t>// case_additions -- r1 shape raised 5 mm thick, no trim</w:t>
+      </w:r>
+      <w:r>
+        <w:rPr>
+          <w:rFonts w:ascii="Courier New" w:hAnsi="Courier New"/>
+          <w:sz w:val="18"/>
+        </w:rPr>
+        <w:br/>
+        <w:t>[4, "r1", 20.0, 15.0, 2.0, 5.0, 5.0, 5.0, []],</w:t>
+      </w:r>
+      <w:r>
+        <w:rPr>
+          <w:rFonts w:ascii="Courier New" w:hAnsi="Courier New"/>
+          <w:sz w:val="18"/>
+        </w:rPr>
+        <w:br/>
+      </w:r>
+      <w:r>
+        <w:rPr>
+          <w:rFonts w:ascii="Courier New" w:hAnsi="Courier New"/>
+          <w:sz w:val="18"/>
+        </w:rPr>
+        <w:br/>
+        <w:t>// case_additions -- full-height tab1 (no cut/build column)</w:t>
+      </w:r>
+      <w:r>
+        <w:rPr>
+          <w:rFonts w:ascii="Courier New" w:hAnsi="Courier New"/>
+          <w:sz w:val="18"/>
+        </w:rPr>
+        <w:br/>
+        <w:t>[5, "tab1", 8.0, 6.0, 1.5, 0, 0, []],</w:t>
+      </w:r>
+      <w:r>
+        <w:rPr>
+          <w:rFonts w:ascii="Courier New" w:hAnsi="Courier New"/>
+          <w:sz w:val="18"/>
+        </w:rPr>
+        <w:br/>
+      </w:r>
+      <w:r>
+        <w:rPr>
+          <w:rFonts w:ascii="Courier New" w:hAnsi="Courier New"/>
+          <w:sz w:val="18"/>
+        </w:rPr>
+        <w:br/>
+        <w:t>// case_additions -- negative shape (edge subtraction), trimmed above at 10 mm</w:t>
+      </w:r>
+      <w:r>
+        <w:rPr>
+          <w:rFonts w:ascii="Courier New" w:hAnsi="Courier New"/>
+          <w:sz w:val="18"/>
+        </w:rPr>
+        <w:br/>
+        <w:t>[6, "-r1", 10.0, 8.0, 0, 0, 0, [10, -999, -999, -999]],</w:t>
       </w:r>
     </w:p>
     <w:sectPr>

</xml_diff>

<commit_message>
Save manual edits: TC38 moves case_additions from my_case_additions to OA V1 file
- keyguard.json: TC38 entry updated (my_case_additions removed, openings path set to openings_and_additions.txt)
- TC38 openings_and_additions_V1.txt: negative-shape case_additions instructions moved here from keyguard.json
- target-spec.docx: updated to reflect new V2 cb-value semantics for negative shapes

Co-Authored-By: Claude Sonnet 4.6 <noreply@anthropic.com>
</commit_message>
<xml_diff>
--- a/OA migration script/target-spec.docx
+++ b/OA migration script/target-spec.docx
@@ -1686,7 +1686,19 @@
           <w:sz w:val="18"/>
         </w:rPr>
         <w:br/>
-        <w:t>Negative shapes (prefix "-", e.g. -r1, -tab2) create edge subtractions. The shapes "r", "-r", "c", and "-c" are not supported in V2 case_additions; use r1-4 instead.</w:t>
+        <w:br/>
+        <w:t>cut/build (cb) semantics:</w:t>
+        <w:br/>
+        <w:t xml:space="preserve">  cb &gt; 0         add shape, extruded to this depth (mm)</w:t>
+        <w:br/>
+        <w:t xml:space="preserve">  cb = 0/omit    add shape, full keyguard height (2D outline addition)</w:t>
+        <w:br/>
+        <w:t xml:space="preserve">  -9 &lt; cb &lt; 0    subtract shape, pocket depth = |cb| mm</w:t>
+        <w:br/>
+        <w:t xml:space="preserve">  cb ≤ -9        subtract shape, full keyguard height (2D outline subtraction)</w:t>
+        <w:br/>
+        <w:br/>
+        <w:t>The shapes “r” and “c” are not supported in V2 case_additions; use r1–4 instead. Negative shape name prefixes (e.g. “-r1”) are not supported in V2; encode subtractions using the cb column instead.</w:t>
       </w:r>
     </w:p>
     <w:tbl>
@@ -1992,7 +2004,7 @@
           </w:tcPr>
           <w:p>
             <w:r>
-              <w:t>Optional number. Omit when full-height (default). Detected by checking whether element [7] is a number.</w:t>
+              <w:t>Optional number. Detected by checking whether element [7] is a number. Semantics: cb &gt; 0 = add shape extruded to depth cb mm; cb = 0 or omitted = add shape full keyguard height (2D outline addition); −9 &lt; cb &lt; 0 = subtract shape pocket depth |cb| mm; cb ≤ −9 = subtract shape full keyguard height (2D outline subtraction).</w:t>
             </w:r>
           </w:p>
         </w:tc>
@@ -2163,7 +2175,7 @@
           <w:sz w:val="18"/>
         </w:rPr>
         <w:br/>
-        <w:t>// case_additions -- negative shape (edge subtraction), trimmed above at 10 mm</w:t>
+        <w:t>// case_additions -- r1 full-height subtraction (cb ≤ -9), trimmed above at 10 mm</w:t>
       </w:r>
       <w:r>
         <w:rPr>
@@ -2171,7 +2183,12 @@
           <w:sz w:val="18"/>
         </w:rPr>
         <w:br/>
-        <w:t>[6, "-r1", 10.0, 8.0, 0, 0, 0, [10, -999, -999, -999]],</w:t>
+        <w:t>[6, "r1", 10.0, 8.0, 0, 0, 0, -9, [10, -999, -999, -999]],</w:t>
+        <w:br/>
+        <w:br/>
+        <w:t>// case_additions -- r2 pocket subtraction 3.5 mm deep, no trim</w:t>
+        <w:br/>
+        <w:t>[7, "r2", 20.0, 15.0, 2.0, 5.0, 5.0, -3.5, []],</w:t>
       </w:r>
     </w:p>
     <w:sectPr>

</xml_diff>

<commit_message>
Fix special params section in target-spec: direction not rotation, r/c/hd only
- Rename "rotation angle" to "direction" throughout
- Remove bump and oa1-4 from the direction parameter section
  (oa1-4 use hardcoded angles in create_cutting_tool; bump is
  dispatched separately and does not use sp[0])
- Remove spurious x from bump's [special] column in usage table

Co-Authored-By: Claude Sonnet 4.6 <noreply@anthropic.com>
</commit_message>
<xml_diff>
--- a/OA migration script/target-spec.docx
+++ b/OA migration script/target-spec.docx
@@ -3052,7 +3052,6 @@
                 <w:i w:val="0"/>
                 <w:sz w:val="18"/>
               </w:rPr>
-              <w:t>x</w:t>
             </w:r>
           </w:p>
         </w:tc>
@@ -4454,7 +4453,7 @@
         <w:pStyle w:val="Heading2"/>
       </w:pPr>
       <w:r>
-        <w:t>r, c, hd, bump, oa1–4 — optional rotation angle</w:t>
+        <w:t>r, c, hd — optional direction</w:t>
       </w:r>
     </w:p>
     <w:p>
@@ -4467,7 +4466,7 @@
           <w:rFonts w:ascii="Courier New" w:hAnsi="Courier New"/>
           <w:sz w:val="18"/>
         </w:rPr>
-        <w:t>[rotation_angle]  or  []</w:t>
+        <w:t>[direction]  or  []</w:t>
       </w:r>
     </w:p>
     <w:p>
@@ -4476,7 +4475,7 @@
           <w:b w:val="0"/>
           <w:i w:val="0"/>
         </w:rPr>
-        <w:t>An optional rotation angle (in degrees) to rotate the shape around the Z axis. Use [] or omit to leave the shape unrotated (0°). The rotation is applied at the shape’s anchor point.</w:t>
+        <w:t>An optional direction angle (in degrees) that rotates the shape around the Z axis. Use [] or omit for no rotation (0°). The rotation is applied at the shape’s anchor point.</w:t>
       </w:r>
     </w:p>
     <w:p>

</xml_diff>

<commit_message>
Remove shape-specific edge slope notes from target-spec
The c/hd-specific rows described designer internals, not O&A format.
The edge slopes table now just documents the three valid formats:
[], [angle], and [top, bottom, left, right].

Co-Authored-By: Claude Sonnet 4.6 <noreply@anthropic.com>
</commit_message>
<xml_diff>
--- a/OA migration script/target-spec.docx
+++ b/OA migration script/target-spec.docx
@@ -4360,71 +4360,7 @@
                 <w:b w:val="0"/>
                 <w:i w:val="0"/>
               </w:rPr>
-              <w:t>Per-edge chamfer angles. Valid for r and hd. Order: top edge, bottom edge, left edge, right edge.</w:t>
-            </w:r>
-          </w:p>
-        </w:tc>
-      </w:tr>
-      <w:tr>
-        <w:tc>
-          <w:tcPr>
-            <w:tcW w:type="dxa" w:w="1800"/>
-          </w:tcPr>
-          <w:p>
-            <w:r>
-              <w:rPr>
-                <w:rFonts w:ascii="Courier New" w:hAnsi="Courier New"/>
-                <w:b w:val="0"/>
-                <w:i w:val="0"/>
-                <w:sz w:val="18"/>
-              </w:rPr>
-              <w:t>[angle]  (for c)</w:t>
-            </w:r>
-          </w:p>
-        </w:tc>
-        <w:tc>
-          <w:tcPr>
-            <w:tcW w:type="dxa" w:w="6840"/>
-          </w:tcPr>
-          <w:p>
-            <w:r>
-              <w:rPr>
-                <w:b w:val="0"/>
-                <w:i w:val="0"/>
-              </w:rPr>
-              <w:t>Apply the chamfer angle to the circular edge. Only 0 or 1 values are valid for c.</w:t>
-            </w:r>
-          </w:p>
-        </w:tc>
-      </w:tr>
-      <w:tr>
-        <w:tc>
-          <w:tcPr>
-            <w:tcW w:type="dxa" w:w="1800"/>
-          </w:tcPr>
-          <w:p>
-            <w:r>
-              <w:rPr>
-                <w:rFonts w:ascii="Courier New" w:hAnsi="Courier New"/>
-                <w:b w:val="0"/>
-                <w:i w:val="0"/>
-                <w:sz w:val="18"/>
-              </w:rPr>
-              <w:t>[angle]  (for hd)</w:t>
-            </w:r>
-          </w:p>
-        </w:tc>
-        <w:tc>
-          <w:tcPr>
-            <w:tcW w:type="dxa" w:w="6840"/>
-          </w:tcPr>
-          <w:p>
-            <w:r>
-              <w:rPr>
-                <w:b w:val="0"/>
-                <w:i w:val="0"/>
-              </w:rPr>
-              <w:t>0, 1, or 4 values. With 4 values: [top, bottom, left, right] where the flat side of the half-disc determines which edge is “top”.</w:t>
+              <w:t>Per-edge chamfer angles. Order: top edge, bottom edge, left edge, right edge.</w:t>
             </w:r>
           </w:p>
         </w:tc>

</xml_diff>